<commit_message>
Locate unregistered outputs and bind native evidence to its corpus - carry the output name and sha-256 on registration failures through a shared recovery exception, filesystem, sharepoint and tools - fail the native record unless results match the exact manifest, case ids, output hashes, every check and the controls - keep corpus json and markdown as lf text so the manifest hash is stable and git diff --check passes - rerun office on the regenerated corpus, 70 of 70 cases, and prove the fixes with 12 removal probes
</commit_message>
<xml_diff>
--- a/tests/OfficeAgent.Tests/Corpus/v1.0.0/native/outputs/w-assembly.docx
+++ b/tests/OfficeAgent.Tests/Corpus/v1.0.0/native/outputs/w-assembly.docx
@@ -8,7 +8,7 @@
         <w:sectPr>
           <w:headerReference xmlns:p7="http://schemas.openxmlformats.org/officeDocument/2006/relationships" w:type="even" p7:id="m1_blank_headereven"/>
           <w:headerReference xmlns:p7="http://schemas.openxmlformats.org/officeDocument/2006/relationships" w:type="first" p7:id="m1_blank_headerfirst"/>
-          <w:headerReference xmlns:p7="http://schemas.openxmlformats.org/officeDocument/2006/relationships" w:type="default" p7:id="m1_R81d58d8cb8f546fd"/>
+          <w:headerReference xmlns:p7="http://schemas.openxmlformats.org/officeDocument/2006/relationships" w:type="default" p7:id="m1_R3452005175154285"/>
           <w:footerReference xmlns:p7="http://schemas.openxmlformats.org/officeDocument/2006/relationships" w:type="even" p7:id="m1_blank_footereven"/>
           <w:footerReference xmlns:p7="http://schemas.openxmlformats.org/officeDocument/2006/relationships" w:type="first" p7:id="m1_blank_footerfirst"/>
           <w:footerReference xmlns:p7="http://schemas.openxmlformats.org/officeDocument/2006/relationships" w:type="default" p7:id="m1_blank_footerdefault"/>
@@ -36,7 +36,7 @@
     <w:sectPr>
       <w:headerReference xmlns:p4="http://schemas.openxmlformats.org/officeDocument/2006/relationships" w:type="even" p4:id="m2_blank_headereven"/>
       <w:headerReference xmlns:p4="http://schemas.openxmlformats.org/officeDocument/2006/relationships" w:type="first" p4:id="m2_blank_headerfirst"/>
-      <w:headerReference xmlns:p4="http://schemas.openxmlformats.org/officeDocument/2006/relationships" w:type="default" p4:id="m2_R93e05ec6bed94f6a"/>
+      <w:headerReference xmlns:p4="http://schemas.openxmlformats.org/officeDocument/2006/relationships" w:type="default" p4:id="m2_Rbb101d4899f9457f"/>
       <w:footerReference xmlns:p4="http://schemas.openxmlformats.org/officeDocument/2006/relationships" w:type="even" p4:id="m2_blank_footereven"/>
       <w:footerReference xmlns:p4="http://schemas.openxmlformats.org/officeDocument/2006/relationships" w:type="first" p4:id="m2_blank_footerfirst"/>
       <w:footerReference xmlns:p4="http://schemas.openxmlformats.org/officeDocument/2006/relationships" w:type="default" p4:id="m2_blank_footerdefault"/>

</xml_diff>

<commit_message>
Add formula calculation, Word conformance verbs and core properties for 1.2.0
- add optional OfficeAgent.Excel.Calculation with an allowlisted ClosedXML engine, per-connection settings and formula-error rejection
- add the link and mergeTableCells verbs, numberingId on format, list nodes, compatibility mode and FindHit.ParaId
- store post-2007 Excel functions with their _xlfn. prefix so setCell formulas no longer show #NAME? in Excel
- republish the native Office record with opened controls and new cases, and ship the tenth package in release checks
</commit_message>
<xml_diff>
--- a/tests/OfficeAgent.Tests/Corpus/v1.0.0/native/outputs/w-assembly.docx
+++ b/tests/OfficeAgent.Tests/Corpus/v1.0.0/native/outputs/w-assembly.docx
@@ -8,7 +8,7 @@
         <w:sectPr>
           <w:headerReference xmlns:p7="http://schemas.openxmlformats.org/officeDocument/2006/relationships" w:type="even" p7:id="m1_blank_headereven"/>
           <w:headerReference xmlns:p7="http://schemas.openxmlformats.org/officeDocument/2006/relationships" w:type="first" p7:id="m1_blank_headerfirst"/>
-          <w:headerReference xmlns:p7="http://schemas.openxmlformats.org/officeDocument/2006/relationships" w:type="default" p7:id="m1_R3452005175154285"/>
+          <w:headerReference xmlns:p7="http://schemas.openxmlformats.org/officeDocument/2006/relationships" w:type="default" p7:id="m1_R5edae1e7f8bc4415"/>
           <w:footerReference xmlns:p7="http://schemas.openxmlformats.org/officeDocument/2006/relationships" w:type="even" p7:id="m1_blank_footereven"/>
           <w:footerReference xmlns:p7="http://schemas.openxmlformats.org/officeDocument/2006/relationships" w:type="first" p7:id="m1_blank_footerfirst"/>
           <w:footerReference xmlns:p7="http://schemas.openxmlformats.org/officeDocument/2006/relationships" w:type="default" p7:id="m1_blank_footerdefault"/>
@@ -36,7 +36,7 @@
     <w:sectPr>
       <w:headerReference xmlns:p4="http://schemas.openxmlformats.org/officeDocument/2006/relationships" w:type="even" p4:id="m2_blank_headereven"/>
       <w:headerReference xmlns:p4="http://schemas.openxmlformats.org/officeDocument/2006/relationships" w:type="first" p4:id="m2_blank_headerfirst"/>
-      <w:headerReference xmlns:p4="http://schemas.openxmlformats.org/officeDocument/2006/relationships" w:type="default" p4:id="m2_Rbb101d4899f9457f"/>
+      <w:headerReference xmlns:p4="http://schemas.openxmlformats.org/officeDocument/2006/relationships" w:type="default" p4:id="m2_R80804bf49a984ee0"/>
       <w:footerReference xmlns:p4="http://schemas.openxmlformats.org/officeDocument/2006/relationships" w:type="even" p4:id="m2_blank_footereven"/>
       <w:footerReference xmlns:p4="http://schemas.openxmlformats.org/officeDocument/2006/relationships" w:type="first" p4:id="m2_blank_footerfirst"/>
       <w:footerReference xmlns:p4="http://schemas.openxmlformats.org/officeDocument/2006/relationships" w:type="default" p4:id="m2_blank_footerdefault"/>

</xml_diff>

<commit_message>
Add report refresh, formatting-safe translation and multi-document edits
- refresh word reports and powerpoint decks from an excel workbook through xl: bindings with refresh_document
- add fillTable, setChartData and bindData verbs plus formatted cell values and defined names in excel inspection
- keep inline formatting when rewriting a paragraph through markedText and withMarked
- apply one plan to many documents with edit_documents and match every occurrence with "match": "all"
</commit_message>
<xml_diff>
--- a/tests/OfficeAgent.Tests/Corpus/v1.0.0/native/outputs/w-assembly.docx
+++ b/tests/OfficeAgent.Tests/Corpus/v1.0.0/native/outputs/w-assembly.docx
@@ -8,7 +8,7 @@
         <w:sectPr>
           <w:headerReference xmlns:p7="http://schemas.openxmlformats.org/officeDocument/2006/relationships" w:type="even" p7:id="m1_blank_headereven"/>
           <w:headerReference xmlns:p7="http://schemas.openxmlformats.org/officeDocument/2006/relationships" w:type="first" p7:id="m1_blank_headerfirst"/>
-          <w:headerReference xmlns:p7="http://schemas.openxmlformats.org/officeDocument/2006/relationships" w:type="default" p7:id="m1_R5edae1e7f8bc4415"/>
+          <w:headerReference xmlns:p7="http://schemas.openxmlformats.org/officeDocument/2006/relationships" w:type="default" p7:id="m1_Rd1b9e9cd6e684d86"/>
           <w:footerReference xmlns:p7="http://schemas.openxmlformats.org/officeDocument/2006/relationships" w:type="even" p7:id="m1_blank_footereven"/>
           <w:footerReference xmlns:p7="http://schemas.openxmlformats.org/officeDocument/2006/relationships" w:type="first" p7:id="m1_blank_footerfirst"/>
           <w:footerReference xmlns:p7="http://schemas.openxmlformats.org/officeDocument/2006/relationships" w:type="default" p7:id="m1_blank_footerdefault"/>
@@ -36,7 +36,7 @@
     <w:sectPr>
       <w:headerReference xmlns:p4="http://schemas.openxmlformats.org/officeDocument/2006/relationships" w:type="even" p4:id="m2_blank_headereven"/>
       <w:headerReference xmlns:p4="http://schemas.openxmlformats.org/officeDocument/2006/relationships" w:type="first" p4:id="m2_blank_headerfirst"/>
-      <w:headerReference xmlns:p4="http://schemas.openxmlformats.org/officeDocument/2006/relationships" w:type="default" p4:id="m2_R80804bf49a984ee0"/>
+      <w:headerReference xmlns:p4="http://schemas.openxmlformats.org/officeDocument/2006/relationships" w:type="default" p4:id="m2_R96fce2c204cd4548"/>
       <w:footerReference xmlns:p4="http://schemas.openxmlformats.org/officeDocument/2006/relationships" w:type="even" p4:id="m2_blank_footereven"/>
       <w:footerReference xmlns:p4="http://schemas.openxmlformats.org/officeDocument/2006/relationships" w:type="first" p4:id="m2_blank_footerfirst"/>
       <w:footerReference xmlns:p4="http://schemas.openxmlformats.org/officeDocument/2006/relationships" w:type="default" p4:id="m2_blank_footerdefault"/>

</xml_diff>

<commit_message>
Fix the review findings in refresh, table fills and marked rewrites
- refuse a marked rewrite of a paragraph holding tabs, breaks, fields, note references or pictures
- keep comment and bookmark anchors in filled word cells and strip them from copied rows
- format accounting and currency built-ins, drop copied slide row ids, and guard combination charts
- read each workbook sheet once per refresh and keep bound officeagent charts updatable
</commit_message>
<xml_diff>
--- a/tests/OfficeAgent.Tests/Corpus/v1.0.0/native/outputs/w-assembly.docx
+++ b/tests/OfficeAgent.Tests/Corpus/v1.0.0/native/outputs/w-assembly.docx
@@ -8,7 +8,7 @@
         <w:sectPr>
           <w:headerReference xmlns:p7="http://schemas.openxmlformats.org/officeDocument/2006/relationships" w:type="even" p7:id="m1_blank_headereven"/>
           <w:headerReference xmlns:p7="http://schemas.openxmlformats.org/officeDocument/2006/relationships" w:type="first" p7:id="m1_blank_headerfirst"/>
-          <w:headerReference xmlns:p7="http://schemas.openxmlformats.org/officeDocument/2006/relationships" w:type="default" p7:id="m1_Rd1b9e9cd6e684d86"/>
+          <w:headerReference xmlns:p7="http://schemas.openxmlformats.org/officeDocument/2006/relationships" w:type="default" p7:id="m1_R38cc45a90704435f"/>
           <w:footerReference xmlns:p7="http://schemas.openxmlformats.org/officeDocument/2006/relationships" w:type="even" p7:id="m1_blank_footereven"/>
           <w:footerReference xmlns:p7="http://schemas.openxmlformats.org/officeDocument/2006/relationships" w:type="first" p7:id="m1_blank_footerfirst"/>
           <w:footerReference xmlns:p7="http://schemas.openxmlformats.org/officeDocument/2006/relationships" w:type="default" p7:id="m1_blank_footerdefault"/>
@@ -36,7 +36,7 @@
     <w:sectPr>
       <w:headerReference xmlns:p4="http://schemas.openxmlformats.org/officeDocument/2006/relationships" w:type="even" p4:id="m2_blank_headereven"/>
       <w:headerReference xmlns:p4="http://schemas.openxmlformats.org/officeDocument/2006/relationships" w:type="first" p4:id="m2_blank_headerfirst"/>
-      <w:headerReference xmlns:p4="http://schemas.openxmlformats.org/officeDocument/2006/relationships" w:type="default" p4:id="m2_R96fce2c204cd4548"/>
+      <w:headerReference xmlns:p4="http://schemas.openxmlformats.org/officeDocument/2006/relationships" w:type="default" p4:id="m2_R0cd9c72159144eaf"/>
       <w:footerReference xmlns:p4="http://schemas.openxmlformats.org/officeDocument/2006/relationships" w:type="even" p4:id="m2_blank_footereven"/>
       <w:footerReference xmlns:p4="http://schemas.openxmlformats.org/officeDocument/2006/relationships" w:type="first" p4:id="m2_blank_footerfirst"/>
       <w:footerReference xmlns:p4="http://schemas.openxmlformats.org/officeDocument/2006/relationships" w:type="default" p4:id="m2_blank_footerdefault"/>

</xml_diff>

<commit_message>
Put new slides on a template's own layouts by name
- resolve insertSlide layouts against the names powerpoint shows, qualified by master when they repeat
- give a slide on a named layout every placeholder the layout defines, under its own shape names
- list each deck's layouts and placeholders in inspect_document and refuse text a layout has no place for
- republish the native record at 84 of 84 cases with a named-layout slide case
</commit_message>
<xml_diff>
--- a/tests/OfficeAgent.Tests/Corpus/v1.0.0/native/outputs/w-assembly.docx
+++ b/tests/OfficeAgent.Tests/Corpus/v1.0.0/native/outputs/w-assembly.docx
@@ -8,7 +8,7 @@
         <w:sectPr>
           <w:headerReference xmlns:p7="http://schemas.openxmlformats.org/officeDocument/2006/relationships" w:type="even" p7:id="m1_blank_headereven"/>
           <w:headerReference xmlns:p7="http://schemas.openxmlformats.org/officeDocument/2006/relationships" w:type="first" p7:id="m1_blank_headerfirst"/>
-          <w:headerReference xmlns:p7="http://schemas.openxmlformats.org/officeDocument/2006/relationships" w:type="default" p7:id="m1_R38cc45a90704435f"/>
+          <w:headerReference xmlns:p7="http://schemas.openxmlformats.org/officeDocument/2006/relationships" w:type="default" p7:id="m1_Rc36847eb352749d9"/>
           <w:footerReference xmlns:p7="http://schemas.openxmlformats.org/officeDocument/2006/relationships" w:type="even" p7:id="m1_blank_footereven"/>
           <w:footerReference xmlns:p7="http://schemas.openxmlformats.org/officeDocument/2006/relationships" w:type="first" p7:id="m1_blank_footerfirst"/>
           <w:footerReference xmlns:p7="http://schemas.openxmlformats.org/officeDocument/2006/relationships" w:type="default" p7:id="m1_blank_footerdefault"/>
@@ -36,7 +36,7 @@
     <w:sectPr>
       <w:headerReference xmlns:p4="http://schemas.openxmlformats.org/officeDocument/2006/relationships" w:type="even" p4:id="m2_blank_headereven"/>
       <w:headerReference xmlns:p4="http://schemas.openxmlformats.org/officeDocument/2006/relationships" w:type="first" p4:id="m2_blank_headerfirst"/>
-      <w:headerReference xmlns:p4="http://schemas.openxmlformats.org/officeDocument/2006/relationships" w:type="default" p4:id="m2_R0cd9c72159144eaf"/>
+      <w:headerReference xmlns:p4="http://schemas.openxmlformats.org/officeDocument/2006/relationships" w:type="default" p4:id="m2_Rccce578831454ec3"/>
       <w:footerReference xmlns:p4="http://schemas.openxmlformats.org/officeDocument/2006/relationships" w:type="even" p4:id="m2_blank_footereven"/>
       <w:footerReference xmlns:p4="http://schemas.openxmlformats.org/officeDocument/2006/relationships" w:type="first" p4:id="m2_blank_footerfirst"/>
       <w:footerReference xmlns:p4="http://schemas.openxmlformats.org/officeDocument/2006/relationships" w:type="default" p4:id="m2_blank_footerdefault"/>

</xml_diff>